<commit_message>
Updates after review to fix issues added additional attachment handling.
</commit_message>
<xml_diff>
--- a/docassemble/UIAppealAfterHearing/data/templates/cover_letter.docx
+++ b/docassemble/UIAppealAfterHearing/data/templates/cover_letter.docx
@@ -33,7 +33,25 @@
           <w:sz w:val="24"/>
           <w:szCs w:val="24"/>
         </w:rPr>
-        <w:t>[0].name_full() }}</w:t>
+        <w:t>[0].</w:t>
+      </w:r>
+      <w:proofErr w:type="spellStart"/>
+      <w:r>
+        <w:rPr>
+          <w:rFonts w:ascii="Times New Roman" w:hAnsi="Times New Roman" w:cs="Times New Roman"/>
+          <w:sz w:val="24"/>
+          <w:szCs w:val="24"/>
+        </w:rPr>
+        <w:t>name_full</w:t>
+      </w:r>
+      <w:proofErr w:type="spellEnd"/>
+      <w:r>
+        <w:rPr>
+          <w:rFonts w:ascii="Times New Roman" w:hAnsi="Times New Roman" w:cs="Times New Roman"/>
+          <w:sz w:val="24"/>
+          <w:szCs w:val="24"/>
+        </w:rPr>
+        <w:t>() }}</w:t>
       </w:r>
     </w:p>
     <w:p>
@@ -67,8 +85,200 @@
           <w:sz w:val="24"/>
           <w:szCs w:val="24"/>
         </w:rPr>
-        <w:t>[0].address.block() }}</w:t>
-      </w:r>
+        <w:t>[0].</w:t>
+      </w:r>
+      <w:proofErr w:type="spellStart"/>
+      <w:r>
+        <w:rPr>
+          <w:rFonts w:ascii="Times New Roman" w:hAnsi="Times New Roman" w:cs="Times New Roman"/>
+          <w:sz w:val="24"/>
+          <w:szCs w:val="24"/>
+        </w:rPr>
+        <w:t>address.</w:t>
+      </w:r>
+      <w:r>
+        <w:rPr>
+          <w:rFonts w:ascii="Times New Roman" w:hAnsi="Times New Roman" w:cs="Times New Roman"/>
+          <w:sz w:val="24"/>
+          <w:szCs w:val="24"/>
+        </w:rPr>
+        <w:t>address</w:t>
+      </w:r>
+      <w:proofErr w:type="spellEnd"/>
+      <w:r>
+        <w:rPr>
+          <w:rFonts w:ascii="Times New Roman" w:hAnsi="Times New Roman" w:cs="Times New Roman"/>
+          <w:sz w:val="24"/>
+          <w:szCs w:val="24"/>
+        </w:rPr>
+        <w:t xml:space="preserve"> }}</w:t>
+      </w:r>
+      <w:r>
+        <w:rPr>
+          <w:rFonts w:ascii="Times New Roman" w:hAnsi="Times New Roman" w:cs="Times New Roman"/>
+          <w:sz w:val="24"/>
+          <w:szCs w:val="24"/>
+        </w:rPr>
+        <w:t>{% if users[0].</w:t>
+      </w:r>
+      <w:proofErr w:type="spellStart"/>
+      <w:r>
+        <w:rPr>
+          <w:rFonts w:ascii="Times New Roman" w:hAnsi="Times New Roman" w:cs="Times New Roman"/>
+          <w:sz w:val="24"/>
+          <w:szCs w:val="24"/>
+        </w:rPr>
+        <w:t>address.unit</w:t>
+      </w:r>
+      <w:proofErr w:type="spellEnd"/>
+      <w:r>
+        <w:rPr>
+          <w:rFonts w:ascii="Times New Roman" w:hAnsi="Times New Roman" w:cs="Times New Roman"/>
+          <w:sz w:val="24"/>
+          <w:szCs w:val="24"/>
+        </w:rPr>
+        <w:t xml:space="preserve"> %},{{ users[0].</w:t>
+      </w:r>
+      <w:proofErr w:type="spellStart"/>
+      <w:r>
+        <w:rPr>
+          <w:rFonts w:ascii="Times New Roman" w:hAnsi="Times New Roman" w:cs="Times New Roman"/>
+          <w:sz w:val="24"/>
+          <w:szCs w:val="24"/>
+        </w:rPr>
+        <w:t>address.unit</w:t>
+      </w:r>
+      <w:proofErr w:type="spellEnd"/>
+      <w:r>
+        <w:rPr>
+          <w:rFonts w:ascii="Times New Roman" w:hAnsi="Times New Roman" w:cs="Times New Roman"/>
+          <w:sz w:val="24"/>
+          <w:szCs w:val="24"/>
+        </w:rPr>
+        <w:t xml:space="preserve"> }}{% endif %}</w:t>
+      </w:r>
+    </w:p>
+    <w:p>
+      <w:pPr>
+        <w:spacing w:after="0" w:line="240" w:lineRule="auto"/>
+        <w:rPr>
+          <w:rFonts w:ascii="Times New Roman" w:hAnsi="Times New Roman" w:cs="Times New Roman"/>
+          <w:sz w:val="24"/>
+          <w:szCs w:val="24"/>
+        </w:rPr>
+      </w:pPr>
+      <w:r>
+        <w:rPr>
+          <w:rFonts w:ascii="Times New Roman" w:hAnsi="Times New Roman" w:cs="Times New Roman"/>
+          <w:sz w:val="24"/>
+          <w:szCs w:val="24"/>
+        </w:rPr>
+        <w:t>{{</w:t>
+      </w:r>
+      <w:r>
+        <w:rPr>
+          <w:rFonts w:ascii="Times New Roman" w:hAnsi="Times New Roman" w:cs="Times New Roman"/>
+          <w:sz w:val="24"/>
+          <w:szCs w:val="24"/>
+        </w:rPr>
+        <w:t xml:space="preserve"> </w:t>
+      </w:r>
+      <w:r>
+        <w:rPr>
+          <w:rFonts w:ascii="Times New Roman" w:hAnsi="Times New Roman" w:cs="Times New Roman"/>
+          <w:sz w:val="24"/>
+          <w:szCs w:val="24"/>
+        </w:rPr>
+        <w:t>users[0].</w:t>
+      </w:r>
+      <w:proofErr w:type="spellStart"/>
+      <w:r>
+        <w:rPr>
+          <w:rFonts w:ascii="Times New Roman" w:hAnsi="Times New Roman" w:cs="Times New Roman"/>
+          <w:sz w:val="24"/>
+          <w:szCs w:val="24"/>
+        </w:rPr>
+        <w:t>address.city</w:t>
+      </w:r>
+      <w:proofErr w:type="spellEnd"/>
+      <w:r>
+        <w:rPr>
+          <w:rFonts w:ascii="Times New Roman" w:hAnsi="Times New Roman" w:cs="Times New Roman"/>
+          <w:sz w:val="24"/>
+          <w:szCs w:val="24"/>
+        </w:rPr>
+        <w:t xml:space="preserve"> }}, {{</w:t>
+      </w:r>
+      <w:r>
+        <w:rPr>
+          <w:rFonts w:ascii="Times New Roman" w:hAnsi="Times New Roman" w:cs="Times New Roman"/>
+          <w:sz w:val="24"/>
+          <w:szCs w:val="24"/>
+        </w:rPr>
+        <w:t xml:space="preserve"> </w:t>
+      </w:r>
+      <w:r>
+        <w:rPr>
+          <w:rFonts w:ascii="Times New Roman" w:hAnsi="Times New Roman" w:cs="Times New Roman"/>
+          <w:sz w:val="24"/>
+          <w:szCs w:val="24"/>
+        </w:rPr>
+        <w:t>users[0].</w:t>
+      </w:r>
+      <w:proofErr w:type="spellStart"/>
+      <w:r>
+        <w:rPr>
+          <w:rFonts w:ascii="Times New Roman" w:hAnsi="Times New Roman" w:cs="Times New Roman"/>
+          <w:sz w:val="24"/>
+          <w:szCs w:val="24"/>
+        </w:rPr>
+        <w:t>address.city</w:t>
+      </w:r>
+      <w:proofErr w:type="spellEnd"/>
+      <w:r>
+        <w:rPr>
+          <w:rFonts w:ascii="Times New Roman" w:hAnsi="Times New Roman" w:cs="Times New Roman"/>
+          <w:sz w:val="24"/>
+          <w:szCs w:val="24"/>
+        </w:rPr>
+        <w:t xml:space="preserve"> }}, {{</w:t>
+      </w:r>
+      <w:r>
+        <w:rPr>
+          <w:rFonts w:ascii="Times New Roman" w:hAnsi="Times New Roman" w:cs="Times New Roman"/>
+          <w:sz w:val="24"/>
+          <w:szCs w:val="24"/>
+        </w:rPr>
+        <w:t xml:space="preserve"> </w:t>
+      </w:r>
+      <w:r>
+        <w:rPr>
+          <w:rFonts w:ascii="Times New Roman" w:hAnsi="Times New Roman" w:cs="Times New Roman"/>
+          <w:sz w:val="24"/>
+          <w:szCs w:val="24"/>
+        </w:rPr>
+        <w:t>users[0].address.zip }}</w:t>
+      </w:r>
+    </w:p>
+    <w:p>
+      <w:pPr>
+        <w:spacing w:after="0" w:line="240" w:lineRule="auto"/>
+        <w:rPr>
+          <w:rFonts w:ascii="Times New Roman" w:hAnsi="Times New Roman" w:cs="Times New Roman"/>
+          <w:sz w:val="24"/>
+          <w:szCs w:val="24"/>
+        </w:rPr>
+      </w:pPr>
+    </w:p>
+    <w:p>
+      <w:pPr>
+        <w:spacing w:after="0" w:line="240" w:lineRule="auto"/>
+        <w:rPr>
+          <w:rFonts w:ascii="Times New Roman" w:hAnsi="Times New Roman" w:cs="Times New Roman"/>
+          <w:sz w:val="24"/>
+          <w:szCs w:val="24"/>
+        </w:rPr>
+      </w:pPr>
     </w:p>
     <w:p>
       <w:pPr>
@@ -95,8 +305,18 @@
           <w:sz w:val="24"/>
           <w:szCs w:val="24"/>
         </w:rPr>
-        <w:t>{{ today().format(“MMMM d, yyyy</w:t>
-      </w:r>
+        <w:t xml:space="preserve">{{ today().format(“MMMM d, </w:t>
+      </w:r>
+      <w:proofErr w:type="spellStart"/>
+      <w:r>
+        <w:rPr>
+          <w:rFonts w:ascii="Times New Roman" w:hAnsi="Times New Roman" w:cs="Times New Roman"/>
+          <w:sz w:val="24"/>
+          <w:szCs w:val="24"/>
+        </w:rPr>
+        <w:t>yyyy</w:t>
+      </w:r>
+      <w:proofErr w:type="spellEnd"/>
       <w:r>
         <w:rPr>
           <w:rFonts w:ascii="Times New Roman" w:hAnsi="Times New Roman" w:cs="Times New Roman"/>
@@ -185,16 +405,14 @@
         </w:rPr>
         <w:t>33 South State Street</w:t>
       </w:r>
-    </w:p>
-    <w:p>
-      <w:pPr>
-        <w:spacing w:after="0" w:line="240" w:lineRule="auto"/>
-        <w:rPr>
-          <w:rFonts w:ascii="Times New Roman" w:hAnsi="Times New Roman" w:cs="Times New Roman"/>
-          <w:sz w:val="24"/>
-          <w:szCs w:val="24"/>
-        </w:rPr>
-      </w:pPr>
+      <w:r>
+        <w:rPr>
+          <w:rFonts w:ascii="Times New Roman" w:hAnsi="Times New Roman" w:cs="Times New Roman"/>
+          <w:sz w:val="24"/>
+          <w:szCs w:val="24"/>
+        </w:rPr>
+        <w:t xml:space="preserve">, </w:t>
+      </w:r>
       <w:r>
         <w:rPr>
           <w:rFonts w:ascii="Times New Roman" w:hAnsi="Times New Roman" w:cs="Times New Roman"/>
@@ -324,7 +542,51 @@
           <w:sz w:val="24"/>
           <w:szCs w:val="24"/>
         </w:rPr>
-        <w:t xml:space="preserve">{{ denial.format(“MM/dd/yyyy”) }} </w:t>
+        <w:t xml:space="preserve">{{ </w:t>
+      </w:r>
+      <w:proofErr w:type="spellStart"/>
+      <w:r>
+        <w:rPr>
+          <w:rFonts w:ascii="Times New Roman" w:hAnsi="Times New Roman" w:cs="Times New Roman"/>
+          <w:sz w:val="24"/>
+          <w:szCs w:val="24"/>
+        </w:rPr>
+        <w:t>decision_date</w:t>
+      </w:r>
+      <w:r>
+        <w:rPr>
+          <w:rFonts w:ascii="Times New Roman" w:hAnsi="Times New Roman" w:cs="Times New Roman"/>
+          <w:sz w:val="24"/>
+          <w:szCs w:val="24"/>
+        </w:rPr>
+        <w:t>.format</w:t>
+      </w:r>
+      <w:proofErr w:type="spellEnd"/>
+      <w:r>
+        <w:rPr>
+          <w:rFonts w:ascii="Times New Roman" w:hAnsi="Times New Roman" w:cs="Times New Roman"/>
+          <w:sz w:val="24"/>
+          <w:szCs w:val="24"/>
+        </w:rPr>
+        <w:t>(“MM/dd/</w:t>
+      </w:r>
+      <w:proofErr w:type="spellStart"/>
+      <w:r>
+        <w:rPr>
+          <w:rFonts w:ascii="Times New Roman" w:hAnsi="Times New Roman" w:cs="Times New Roman"/>
+          <w:sz w:val="24"/>
+          <w:szCs w:val="24"/>
+        </w:rPr>
+        <w:t>yyyy</w:t>
+      </w:r>
+      <w:proofErr w:type="spellEnd"/>
+      <w:r>
+        <w:rPr>
+          <w:rFonts w:ascii="Times New Roman" w:hAnsi="Times New Roman" w:cs="Times New Roman"/>
+          <w:sz w:val="24"/>
+          <w:szCs w:val="24"/>
+        </w:rPr>
+        <w:t xml:space="preserve">”) }} </w:t>
       </w:r>
       <w:r>
         <w:rPr>
@@ -359,7 +621,8 @@
     <w:p>
       <w:pPr>
         <w:tabs>
-          <w:tab w:val="left" w:pos="2880"/>
+          <w:tab w:val="left" w:pos="3600"/>
+          <w:tab w:val="left" w:pos="3690"/>
           <w:tab w:val="left" w:pos="7200"/>
         </w:tabs>
         <w:spacing w:after="0" w:line="240" w:lineRule="auto"/>
@@ -394,8 +657,9 @@
           <w:szCs w:val="24"/>
           <w:u w:val="single"/>
         </w:rPr>
-        <w:t>{{ users[0].name_full() }}</w:t>
-      </w:r>
+        <w:t>{{ users[0].</w:t>
+      </w:r>
+      <w:proofErr w:type="spellStart"/>
       <w:r>
         <w:rPr>
           <w:rFonts w:ascii="Times New Roman" w:hAnsi="Times New Roman" w:cs="Times New Roman"/>
@@ -403,6 +667,25 @@
           <w:szCs w:val="24"/>
           <w:u w:val="single"/>
         </w:rPr>
+        <w:t>name_full</w:t>
+      </w:r>
+      <w:proofErr w:type="spellEnd"/>
+      <w:r>
+        <w:rPr>
+          <w:rFonts w:ascii="Times New Roman" w:hAnsi="Times New Roman" w:cs="Times New Roman"/>
+          <w:sz w:val="24"/>
+          <w:szCs w:val="24"/>
+          <w:u w:val="single"/>
+        </w:rPr>
+        <w:t>() }}</w:t>
+      </w:r>
+      <w:r>
+        <w:rPr>
+          <w:rFonts w:ascii="Times New Roman" w:hAnsi="Times New Roman" w:cs="Times New Roman"/>
+          <w:sz w:val="24"/>
+          <w:szCs w:val="24"/>
+          <w:u w:val="single"/>
+        </w:rPr>
         <w:t xml:space="preserve">                     </w:t>
       </w:r>
       <w:r>
@@ -418,7 +701,8 @@
     <w:p>
       <w:pPr>
         <w:tabs>
-          <w:tab w:val="left" w:pos="2880"/>
+          <w:tab w:val="left" w:pos="3600"/>
+          <w:tab w:val="left" w:pos="3690"/>
           <w:tab w:val="left" w:pos="7200"/>
         </w:tabs>
         <w:spacing w:after="0" w:line="240" w:lineRule="auto"/>
@@ -436,7 +720,15 @@
           <w:sz w:val="24"/>
           <w:szCs w:val="24"/>
         </w:rPr>
-        <w:t>Social Security Number:</w:t>
+        <w:t>Claimant ID or last 4 of SSN</w:t>
+      </w:r>
+      <w:r>
+        <w:rPr>
+          <w:rFonts w:ascii="Times New Roman" w:hAnsi="Times New Roman" w:cs="Times New Roman"/>
+          <w:sz w:val="24"/>
+          <w:szCs w:val="24"/>
+        </w:rPr>
+        <w:t>:</w:t>
       </w:r>
       <w:r>
         <w:rPr>
@@ -453,7 +745,7 @@
           <w:szCs w:val="24"/>
           <w:u w:val="single"/>
         </w:rPr>
-        <w:t>{{ users[0].</w:t>
+        <w:t xml:space="preserve">{{ </w:t>
       </w:r>
       <w:r>
         <w:rPr>
@@ -462,6 +754,25 @@
           <w:szCs w:val="24"/>
           <w:u w:val="single"/>
         </w:rPr>
+        <w:t>(</w:t>
+      </w:r>
+      <w:r>
+        <w:rPr>
+          <w:rFonts w:ascii="Times New Roman" w:hAnsi="Times New Roman" w:cs="Times New Roman"/>
+          <w:sz w:val="24"/>
+          <w:szCs w:val="24"/>
+          <w:u w:val="single"/>
+        </w:rPr>
+        <w:t>users[0].</w:t>
+      </w:r>
+      <w:proofErr w:type="spellStart"/>
+      <w:r>
+        <w:rPr>
+          <w:rFonts w:ascii="Times New Roman" w:hAnsi="Times New Roman" w:cs="Times New Roman"/>
+          <w:sz w:val="24"/>
+          <w:szCs w:val="24"/>
+          <w:u w:val="single"/>
+        </w:rPr>
         <w:t>id_or_</w:t>
       </w:r>
       <w:r>
@@ -471,7 +782,7 @@
           <w:szCs w:val="24"/>
           <w:u w:val="single"/>
         </w:rPr>
-        <w:t>ssn }</w:t>
+        <w:t>ssn</w:t>
       </w:r>
       <w:r>
         <w:rPr>
@@ -480,6 +791,43 @@
           <w:szCs w:val="24"/>
           <w:u w:val="single"/>
         </w:rPr>
+        <w:t>|int</w:t>
+      </w:r>
+      <w:proofErr w:type="spellEnd"/>
+      <w:r>
+        <w:rPr>
+          <w:rFonts w:ascii="Times New Roman" w:hAnsi="Times New Roman" w:cs="Times New Roman"/>
+          <w:sz w:val="24"/>
+          <w:szCs w:val="24"/>
+          <w:u w:val="single"/>
+        </w:rPr>
+        <w:t>)</w:t>
+      </w:r>
+      <w:r>
+        <w:rPr>
+          <w:rFonts w:ascii="Times New Roman" w:hAnsi="Times New Roman" w:cs="Times New Roman"/>
+          <w:sz w:val="24"/>
+          <w:szCs w:val="24"/>
+          <w:u w:val="single"/>
+        </w:rPr>
+        <w:t>|string</w:t>
+      </w:r>
+      <w:r>
+        <w:rPr>
+          <w:rFonts w:ascii="Times New Roman" w:hAnsi="Times New Roman" w:cs="Times New Roman"/>
+          <w:sz w:val="24"/>
+          <w:szCs w:val="24"/>
+          <w:u w:val="single"/>
+        </w:rPr>
+        <w:t xml:space="preserve"> }</w:t>
+      </w:r>
+      <w:r>
+        <w:rPr>
+          <w:rFonts w:ascii="Times New Roman" w:hAnsi="Times New Roman" w:cs="Times New Roman"/>
+          <w:sz w:val="24"/>
+          <w:szCs w:val="24"/>
+          <w:u w:val="single"/>
+        </w:rPr>
         <w:t>}</w:t>
       </w:r>
       <w:r>
@@ -498,13 +846,14 @@
           <w:szCs w:val="24"/>
           <w:u w:val="single"/>
         </w:rPr>
-        <w:t xml:space="preserve">            </w:t>
+        <w:tab/>
       </w:r>
     </w:p>
     <w:p>
       <w:pPr>
         <w:tabs>
-          <w:tab w:val="left" w:pos="2880"/>
+          <w:tab w:val="left" w:pos="3600"/>
+          <w:tab w:val="left" w:pos="3690"/>
           <w:tab w:val="left" w:pos="7200"/>
         </w:tabs>
         <w:spacing w:after="0" w:line="240" w:lineRule="auto"/>
@@ -539,8 +888,9 @@
           <w:szCs w:val="24"/>
           <w:u w:val="single"/>
         </w:rPr>
-        <w:t>{{ users[0].phone_number }}</w:t>
-      </w:r>
+        <w:t xml:space="preserve">{{ </w:t>
+      </w:r>
+      <w:proofErr w:type="spellStart"/>
       <w:r>
         <w:rPr>
           <w:rFonts w:ascii="Times New Roman" w:hAnsi="Times New Roman" w:cs="Times New Roman"/>
@@ -548,6 +898,71 @@
           <w:szCs w:val="24"/>
           <w:u w:val="single"/>
         </w:rPr>
+        <w:t>phone_number_formatted</w:t>
+      </w:r>
+      <w:proofErr w:type="spellEnd"/>
+      <w:r>
+        <w:rPr>
+          <w:rFonts w:ascii="Times New Roman" w:hAnsi="Times New Roman" w:cs="Times New Roman"/>
+          <w:sz w:val="24"/>
+          <w:szCs w:val="24"/>
+          <w:u w:val="single"/>
+        </w:rPr>
+        <w:t>(users[0].</w:t>
+      </w:r>
+      <w:proofErr w:type="spellStart"/>
+      <w:r>
+        <w:rPr>
+          <w:rFonts w:ascii="Times New Roman" w:hAnsi="Times New Roman" w:cs="Times New Roman"/>
+          <w:sz w:val="24"/>
+          <w:szCs w:val="24"/>
+          <w:u w:val="single"/>
+        </w:rPr>
+        <w:t>phone_number</w:t>
+      </w:r>
+      <w:proofErr w:type="spellEnd"/>
+      <w:r>
+        <w:rPr>
+          <w:rFonts w:ascii="Times New Roman" w:hAnsi="Times New Roman" w:cs="Times New Roman"/>
+          <w:sz w:val="24"/>
+          <w:szCs w:val="24"/>
+          <w:u w:val="single"/>
+        </w:rPr>
+        <w:t>)</w:t>
+      </w:r>
+    </w:p>
+    <w:p>
+      <w:pPr>
+        <w:tabs>
+          <w:tab w:val="left" w:pos="3600"/>
+          <w:tab w:val="left" w:pos="3690"/>
+          <w:tab w:val="left" w:pos="7200"/>
+        </w:tabs>
+        <w:spacing w:after="0" w:line="240" w:lineRule="auto"/>
+        <w:ind w:firstLine="360"/>
+        <w:rPr>
+          <w:rFonts w:ascii="Times New Roman" w:hAnsi="Times New Roman" w:cs="Times New Roman"/>
+          <w:sz w:val="24"/>
+          <w:szCs w:val="24"/>
+          <w:u w:val="single"/>
+        </w:rPr>
+      </w:pPr>
+      <w:r>
+        <w:rPr>
+          <w:rFonts w:ascii="Times New Roman" w:hAnsi="Times New Roman" w:cs="Times New Roman"/>
+          <w:sz w:val="24"/>
+          <w:szCs w:val="24"/>
+          <w:u w:val="single"/>
+        </w:rPr>
+        <w:t>}}</w:t>
+      </w:r>
+      <w:r>
+        <w:rPr>
+          <w:rFonts w:ascii="Times New Roman" w:hAnsi="Times New Roman" w:cs="Times New Roman"/>
+          <w:sz w:val="24"/>
+          <w:szCs w:val="24"/>
+          <w:u w:val="single"/>
+        </w:rPr>
         <w:tab/>
       </w:r>
       <w:r>
@@ -557,7 +972,7 @@
           <w:szCs w:val="24"/>
           <w:u w:val="single"/>
         </w:rPr>
-        <w:t xml:space="preserve">            </w:t>
+        <w:tab/>
       </w:r>
     </w:p>
     <w:p>
@@ -654,7 +1069,25 @@
           <w:sz w:val="24"/>
           <w:szCs w:val="24"/>
         </w:rPr>
-        <w:t>{{ doc.name.text }}</w:t>
+        <w:t xml:space="preserve">{{ </w:t>
+      </w:r>
+      <w:proofErr w:type="spellStart"/>
+      <w:r>
+        <w:rPr>
+          <w:rFonts w:ascii="Times New Roman" w:hAnsi="Times New Roman" w:cs="Times New Roman"/>
+          <w:sz w:val="24"/>
+          <w:szCs w:val="24"/>
+        </w:rPr>
+        <w:t>doc.name.text</w:t>
+      </w:r>
+      <w:proofErr w:type="spellEnd"/>
+      <w:r>
+        <w:rPr>
+          <w:rFonts w:ascii="Times New Roman" w:hAnsi="Times New Roman" w:cs="Times New Roman"/>
+          <w:sz w:val="24"/>
+          <w:szCs w:val="24"/>
+        </w:rPr>
+        <w:t xml:space="preserve"> }}</w:t>
       </w:r>
       <w:r>
         <w:rPr>
@@ -670,16 +1103,268 @@
           <w:sz w:val="24"/>
           <w:szCs w:val="24"/>
         </w:rPr>
-        <w:t>{{ doc.</w:t>
-      </w:r>
-      <w:r>
-        <w:rPr>
-          <w:rFonts w:ascii="Times New Roman" w:hAnsi="Times New Roman" w:cs="Times New Roman"/>
-          <w:sz w:val="24"/>
-          <w:szCs w:val="24"/>
-        </w:rPr>
-        <w:t>desc</w:t>
-      </w:r>
+        <w:t xml:space="preserve">{{ </w:t>
+      </w:r>
+      <w:proofErr w:type="spellStart"/>
+      <w:r>
+        <w:rPr>
+          <w:rFonts w:ascii="Times New Roman" w:hAnsi="Times New Roman" w:cs="Times New Roman"/>
+          <w:sz w:val="24"/>
+          <w:szCs w:val="24"/>
+        </w:rPr>
+        <w:t>doc.desc</w:t>
+      </w:r>
+      <w:proofErr w:type="spellEnd"/>
+      <w:r>
+        <w:rPr>
+          <w:rFonts w:ascii="Times New Roman" w:hAnsi="Times New Roman" w:cs="Times New Roman"/>
+          <w:sz w:val="24"/>
+          <w:szCs w:val="24"/>
+        </w:rPr>
+        <w:t xml:space="preserve"> }}</w:t>
+      </w:r>
+    </w:p>
+    <w:p>
+      <w:pPr>
+        <w:spacing w:after="0" w:line="240" w:lineRule="auto"/>
+        <w:rPr>
+          <w:rFonts w:ascii="Times New Roman" w:hAnsi="Times New Roman" w:cs="Times New Roman"/>
+          <w:sz w:val="24"/>
+          <w:szCs w:val="24"/>
+        </w:rPr>
+      </w:pPr>
+      <w:r>
+        <w:rPr>
+          <w:rFonts w:ascii="Times New Roman" w:hAnsi="Times New Roman" w:cs="Times New Roman"/>
+          <w:sz w:val="24"/>
+          <w:szCs w:val="24"/>
+        </w:rPr>
+        <w:t xml:space="preserve">{%p </w:t>
+      </w:r>
+      <w:proofErr w:type="spellStart"/>
+      <w:r>
+        <w:rPr>
+          <w:rFonts w:ascii="Times New Roman" w:hAnsi="Times New Roman" w:cs="Times New Roman"/>
+          <w:sz w:val="24"/>
+          <w:szCs w:val="24"/>
+        </w:rPr>
+        <w:t>endfor</w:t>
+      </w:r>
+      <w:proofErr w:type="spellEnd"/>
+      <w:r>
+        <w:rPr>
+          <w:rFonts w:ascii="Times New Roman" w:hAnsi="Times New Roman" w:cs="Times New Roman"/>
+          <w:sz w:val="24"/>
+          <w:szCs w:val="24"/>
+        </w:rPr>
+        <w:t xml:space="preserve"> %</w:t>
+      </w:r>
+      <w:r>
+        <w:rPr>
+          <w:rFonts w:ascii="Times New Roman" w:hAnsi="Times New Roman" w:cs="Times New Roman"/>
+          <w:sz w:val="24"/>
+          <w:szCs w:val="24"/>
+        </w:rPr>
+        <w:t>}</w:t>
+      </w:r>
+    </w:p>
+    <w:p>
+      <w:pPr>
+        <w:spacing w:after="0" w:line="240" w:lineRule="auto"/>
+        <w:rPr>
+          <w:rFonts w:ascii="Times New Roman" w:hAnsi="Times New Roman" w:cs="Times New Roman"/>
+          <w:sz w:val="24"/>
+          <w:szCs w:val="24"/>
+        </w:rPr>
+      </w:pPr>
+    </w:p>
+    <w:p>
+      <w:pPr>
+        <w:spacing w:after="0" w:line="240" w:lineRule="auto"/>
+        <w:rPr>
+          <w:rFonts w:ascii="Times New Roman" w:hAnsi="Times New Roman" w:cs="Times New Roman"/>
+          <w:sz w:val="24"/>
+          <w:szCs w:val="24"/>
+        </w:rPr>
+      </w:pPr>
+      <w:r>
+        <w:rPr>
+          <w:rFonts w:ascii="Times New Roman" w:hAnsi="Times New Roman" w:cs="Times New Roman"/>
+          <w:sz w:val="24"/>
+          <w:szCs w:val="24"/>
+        </w:rPr>
+        <w:t>{</w:t>
+      </w:r>
+      <w:r>
+        <w:rPr>
+          <w:rFonts w:ascii="Times New Roman" w:hAnsi="Times New Roman" w:cs="Times New Roman"/>
+          <w:sz w:val="24"/>
+          <w:szCs w:val="24"/>
+        </w:rPr>
+        <w:t>%</w:t>
+      </w:r>
+      <w:r>
+        <w:rPr>
+          <w:rFonts w:ascii="Times New Roman" w:hAnsi="Times New Roman" w:cs="Times New Roman"/>
+          <w:sz w:val="24"/>
+          <w:szCs w:val="24"/>
+        </w:rPr>
+        <w:t>p</w:t>
+      </w:r>
+      <w:r>
+        <w:rPr>
+          <w:rFonts w:ascii="Times New Roman" w:hAnsi="Times New Roman" w:cs="Times New Roman"/>
+          <w:sz w:val="24"/>
+          <w:szCs w:val="24"/>
+        </w:rPr>
+        <w:t xml:space="preserve"> if </w:t>
+      </w:r>
+      <w:proofErr w:type="spellStart"/>
+      <w:r>
+        <w:rPr>
+          <w:rFonts w:ascii="Times New Roman" w:hAnsi="Times New Roman" w:cs="Times New Roman"/>
+          <w:sz w:val="24"/>
+          <w:szCs w:val="24"/>
+        </w:rPr>
+        <w:t>attended_hearing</w:t>
+      </w:r>
+      <w:proofErr w:type="spellEnd"/>
+      <w:r>
+        <w:rPr>
+          <w:rFonts w:ascii="Times New Roman" w:hAnsi="Times New Roman" w:cs="Times New Roman"/>
+          <w:sz w:val="24"/>
+          <w:szCs w:val="24"/>
+        </w:rPr>
+        <w:t xml:space="preserve"> == False</w:t>
+      </w:r>
+      <w:r>
+        <w:rPr>
+          <w:rFonts w:ascii="Times New Roman" w:hAnsi="Times New Roman" w:cs="Times New Roman"/>
+          <w:sz w:val="24"/>
+          <w:szCs w:val="24"/>
+        </w:rPr>
+        <w:t xml:space="preserve"> %}</w:t>
+      </w:r>
+    </w:p>
+    <w:p>
+      <w:pPr>
+        <w:spacing w:after="0" w:line="240" w:lineRule="auto"/>
+        <w:rPr>
+          <w:rFonts w:ascii="Times New Roman" w:hAnsi="Times New Roman" w:cs="Times New Roman"/>
+          <w:sz w:val="24"/>
+          <w:szCs w:val="24"/>
+        </w:rPr>
+      </w:pPr>
+      <w:r>
+        <w:rPr>
+          <w:rFonts w:ascii="Times New Roman" w:hAnsi="Times New Roman" w:cs="Times New Roman"/>
+          <w:sz w:val="24"/>
+          <w:szCs w:val="24"/>
+        </w:rPr>
+        <w:t xml:space="preserve">I did not present the documents at the hearing </w:t>
+      </w:r>
+      <w:r>
+        <w:rPr>
+          <w:rFonts w:ascii="Times New Roman" w:hAnsi="Times New Roman" w:cs="Times New Roman"/>
+          <w:sz w:val="24"/>
+          <w:szCs w:val="24"/>
+        </w:rPr>
+        <w:t xml:space="preserve">on {{ </w:t>
+      </w:r>
+      <w:proofErr w:type="spellStart"/>
+      <w:r>
+        <w:rPr>
+          <w:rFonts w:ascii="Times New Roman" w:hAnsi="Times New Roman" w:cs="Times New Roman"/>
+          <w:sz w:val="24"/>
+          <w:szCs w:val="24"/>
+        </w:rPr>
+        <w:t>hearing_date</w:t>
+      </w:r>
+      <w:r>
+        <w:rPr>
+          <w:rFonts w:ascii="Times New Roman" w:hAnsi="Times New Roman" w:cs="Times New Roman"/>
+          <w:sz w:val="24"/>
+          <w:szCs w:val="24"/>
+        </w:rPr>
+        <w:t>.format</w:t>
+      </w:r>
+      <w:proofErr w:type="spellEnd"/>
+      <w:r>
+        <w:rPr>
+          <w:rFonts w:ascii="Times New Roman" w:hAnsi="Times New Roman" w:cs="Times New Roman"/>
+          <w:sz w:val="24"/>
+          <w:szCs w:val="24"/>
+        </w:rPr>
+        <w:t xml:space="preserve">(“MMMM d, </w:t>
+      </w:r>
+      <w:proofErr w:type="spellStart"/>
+      <w:r>
+        <w:rPr>
+          <w:rFonts w:ascii="Times New Roman" w:hAnsi="Times New Roman" w:cs="Times New Roman"/>
+          <w:sz w:val="24"/>
+          <w:szCs w:val="24"/>
+        </w:rPr>
+        <w:t>yyyy</w:t>
+      </w:r>
+      <w:proofErr w:type="spellEnd"/>
+      <w:r>
+        <w:rPr>
+          <w:rFonts w:ascii="Times New Roman" w:hAnsi="Times New Roman" w:cs="Times New Roman"/>
+          <w:sz w:val="24"/>
+          <w:szCs w:val="24"/>
+        </w:rPr>
+        <w:t xml:space="preserve">”) </w:t>
+      </w:r>
+      <w:r>
+        <w:rPr>
+          <w:rFonts w:ascii="Times New Roman" w:hAnsi="Times New Roman" w:cs="Times New Roman"/>
+          <w:sz w:val="24"/>
+          <w:szCs w:val="24"/>
+        </w:rPr>
+        <w:t>}}</w:t>
+      </w:r>
+      <w:r>
+        <w:rPr>
+          <w:rFonts w:ascii="Times New Roman" w:hAnsi="Times New Roman" w:cs="Times New Roman"/>
+          <w:sz w:val="24"/>
+          <w:szCs w:val="24"/>
+        </w:rPr>
+        <w:t xml:space="preserve"> </w:t>
+      </w:r>
+      <w:r>
+        <w:rPr>
+          <w:rFonts w:ascii="Times New Roman" w:hAnsi="Times New Roman" w:cs="Times New Roman"/>
+          <w:sz w:val="24"/>
+          <w:szCs w:val="24"/>
+        </w:rPr>
+        <w:t xml:space="preserve"> because: </w:t>
+      </w:r>
+      <w:r>
+        <w:rPr>
+          <w:rFonts w:ascii="Times New Roman" w:hAnsi="Times New Roman" w:cs="Times New Roman"/>
+          <w:sz w:val="24"/>
+          <w:szCs w:val="24"/>
+        </w:rPr>
+        <w:t>{</w:t>
+      </w:r>
+      <w:r>
+        <w:rPr>
+          <w:rFonts w:ascii="Times New Roman" w:hAnsi="Times New Roman" w:cs="Times New Roman"/>
+          <w:sz w:val="24"/>
+          <w:szCs w:val="24"/>
+        </w:rPr>
+        <w:t xml:space="preserve">{ </w:t>
+      </w:r>
+      <w:proofErr w:type="spellStart"/>
+      <w:r>
+        <w:rPr>
+          <w:rFonts w:ascii="Times New Roman" w:hAnsi="Times New Roman" w:cs="Times New Roman"/>
+          <w:sz w:val="24"/>
+          <w:szCs w:val="24"/>
+        </w:rPr>
+        <w:t>missed_hearing_explanation</w:t>
+      </w:r>
+      <w:proofErr w:type="spellEnd"/>
       <w:r>
         <w:rPr>
           <w:rFonts w:ascii="Times New Roman" w:hAnsi="Times New Roman" w:cs="Times New Roman"/>
@@ -712,34 +1397,6 @@
           <w:sz w:val="24"/>
           <w:szCs w:val="24"/>
         </w:rPr>
-        <w:t>{%p endfor %}</w:t>
-      </w:r>
-    </w:p>
-    <w:p>
-      <w:pPr>
-        <w:spacing w:after="0" w:line="240" w:lineRule="auto"/>
-        <w:rPr>
-          <w:rFonts w:ascii="Times New Roman" w:hAnsi="Times New Roman" w:cs="Times New Roman"/>
-          <w:sz w:val="24"/>
-          <w:szCs w:val="24"/>
-        </w:rPr>
-      </w:pPr>
-    </w:p>
-    <w:p>
-      <w:pPr>
-        <w:spacing w:after="0" w:line="240" w:lineRule="auto"/>
-        <w:rPr>
-          <w:rFonts w:ascii="Times New Roman" w:hAnsi="Times New Roman" w:cs="Times New Roman"/>
-          <w:sz w:val="24"/>
-          <w:szCs w:val="24"/>
-        </w:rPr>
-      </w:pPr>
-      <w:r>
-        <w:rPr>
-          <w:rFonts w:ascii="Times New Roman" w:hAnsi="Times New Roman" w:cs="Times New Roman"/>
-          <w:sz w:val="24"/>
-          <w:szCs w:val="24"/>
-        </w:rPr>
         <w:t>{</w:t>
       </w:r>
       <w:r>
@@ -764,7 +1421,7 @@
           <w:sz w:val="24"/>
           <w:szCs w:val="24"/>
         </w:rPr>
-        <w:t xml:space="preserve"> if attended_hearing == False</w:t>
+        <w:t xml:space="preserve"> endif</w:t>
       </w:r>
       <w:r>
         <w:rPr>
@@ -784,45 +1441,119 @@
           <w:szCs w:val="24"/>
         </w:rPr>
       </w:pPr>
-      <w:r>
-        <w:rPr>
-          <w:rFonts w:ascii="Times New Roman" w:hAnsi="Times New Roman" w:cs="Times New Roman"/>
-          <w:sz w:val="24"/>
-          <w:szCs w:val="24"/>
-        </w:rPr>
-        <w:t xml:space="preserve">I did not present the documents at the hearing </w:t>
-      </w:r>
-      <w:r>
-        <w:rPr>
-          <w:rFonts w:ascii="Times New Roman" w:hAnsi="Times New Roman" w:cs="Times New Roman"/>
-          <w:sz w:val="24"/>
-          <w:szCs w:val="24"/>
-        </w:rPr>
-        <w:t xml:space="preserve">on </w:t>
-      </w:r>
-      <w:r>
-        <w:rPr>
-          <w:rFonts w:ascii="Times New Roman" w:hAnsi="Times New Roman" w:cs="Times New Roman"/>
-          <w:sz w:val="24"/>
-          <w:szCs w:val="24"/>
-        </w:rPr>
-        <w:t>{{ hearing_date</w:t>
-      </w:r>
-      <w:r>
-        <w:rPr>
-          <w:rFonts w:ascii="Times New Roman" w:hAnsi="Times New Roman" w:cs="Times New Roman"/>
-          <w:sz w:val="24"/>
-          <w:szCs w:val="24"/>
-        </w:rPr>
-        <w:t>.format(“MMMM d, yyyy</w:t>
-      </w:r>
-      <w:r>
-        <w:rPr>
-          <w:rFonts w:ascii="Times New Roman" w:hAnsi="Times New Roman" w:cs="Times New Roman"/>
-          <w:sz w:val="24"/>
-          <w:szCs w:val="24"/>
-        </w:rPr>
-        <w:t xml:space="preserve">”) </w:t>
+    </w:p>
+    <w:p>
+      <w:pPr>
+        <w:spacing w:after="0" w:line="240" w:lineRule="auto"/>
+        <w:rPr>
+          <w:rFonts w:ascii="Times New Roman" w:hAnsi="Times New Roman" w:cs="Times New Roman"/>
+          <w:sz w:val="24"/>
+          <w:szCs w:val="24"/>
+        </w:rPr>
+      </w:pPr>
+      <w:r>
+        <w:rPr>
+          <w:rFonts w:ascii="Times New Roman" w:hAnsi="Times New Roman" w:cs="Times New Roman"/>
+          <w:sz w:val="24"/>
+          <w:szCs w:val="24"/>
+        </w:rPr>
+        <w:t xml:space="preserve">{%p if </w:t>
+      </w:r>
+      <w:proofErr w:type="spellStart"/>
+      <w:r>
+        <w:rPr>
+          <w:rFonts w:ascii="Times New Roman" w:hAnsi="Times New Roman" w:cs="Times New Roman"/>
+          <w:sz w:val="24"/>
+          <w:szCs w:val="24"/>
+        </w:rPr>
+        <w:t>request_transrcipt</w:t>
+      </w:r>
+      <w:proofErr w:type="spellEnd"/>
+      <w:r>
+        <w:rPr>
+          <w:rFonts w:ascii="Times New Roman" w:hAnsi="Times New Roman" w:cs="Times New Roman"/>
+          <w:sz w:val="24"/>
+          <w:szCs w:val="24"/>
+        </w:rPr>
+        <w:t xml:space="preserve"> %}</w:t>
+      </w:r>
+    </w:p>
+    <w:p>
+      <w:pPr>
+        <w:spacing w:after="0" w:line="240" w:lineRule="auto"/>
+        <w:rPr>
+          <w:rFonts w:ascii="Times New Roman" w:hAnsi="Times New Roman" w:cs="Times New Roman"/>
+          <w:sz w:val="24"/>
+          <w:szCs w:val="24"/>
+        </w:rPr>
+      </w:pPr>
+      <w:r>
+        <w:rPr>
+          <w:rFonts w:ascii="Times New Roman" w:hAnsi="Times New Roman" w:cs="Times New Roman"/>
+          <w:sz w:val="24"/>
+          <w:szCs w:val="24"/>
+        </w:rPr>
+        <w:t xml:space="preserve">Please send a copy of the transcript of the </w:t>
+      </w:r>
+      <w:r>
+        <w:rPr>
+          <w:rFonts w:ascii="Times New Roman" w:hAnsi="Times New Roman" w:cs="Times New Roman"/>
+          <w:sz w:val="24"/>
+          <w:szCs w:val="24"/>
+        </w:rPr>
+        <w:t xml:space="preserve">{{ </w:t>
+      </w:r>
+      <w:proofErr w:type="spellStart"/>
+      <w:r>
+        <w:rPr>
+          <w:rFonts w:ascii="Times New Roman" w:hAnsi="Times New Roman" w:cs="Times New Roman"/>
+          <w:sz w:val="24"/>
+          <w:szCs w:val="24"/>
+        </w:rPr>
+        <w:t>hearing_date</w:t>
+      </w:r>
+      <w:r>
+        <w:rPr>
+          <w:rFonts w:ascii="Times New Roman" w:hAnsi="Times New Roman" w:cs="Times New Roman"/>
+          <w:sz w:val="24"/>
+          <w:szCs w:val="24"/>
+        </w:rPr>
+        <w:t>.format</w:t>
+      </w:r>
+      <w:proofErr w:type="spellEnd"/>
+      <w:r>
+        <w:rPr>
+          <w:rFonts w:ascii="Times New Roman" w:hAnsi="Times New Roman" w:cs="Times New Roman"/>
+          <w:sz w:val="24"/>
+          <w:szCs w:val="24"/>
+        </w:rPr>
+        <w:t xml:space="preserve">(“MMMM d, </w:t>
+      </w:r>
+      <w:proofErr w:type="spellStart"/>
+      <w:r>
+        <w:rPr>
+          <w:rFonts w:ascii="Times New Roman" w:hAnsi="Times New Roman" w:cs="Times New Roman"/>
+          <w:sz w:val="24"/>
+          <w:szCs w:val="24"/>
+        </w:rPr>
+        <w:t>yyyy</w:t>
+      </w:r>
+      <w:proofErr w:type="spellEnd"/>
+      <w:r>
+        <w:rPr>
+          <w:rFonts w:ascii="Times New Roman" w:hAnsi="Times New Roman" w:cs="Times New Roman"/>
+          <w:sz w:val="24"/>
+          <w:szCs w:val="24"/>
+        </w:rPr>
+        <w:t>”</w:t>
+      </w:r>
+      <w:r>
+        <w:rPr>
+          <w:rFonts w:ascii="Times New Roman" w:hAnsi="Times New Roman" w:cs="Times New Roman"/>
+          <w:sz w:val="24"/>
+          <w:szCs w:val="24"/>
+        </w:rPr>
+        <w:t xml:space="preserve">) </w:t>
       </w:r>
       <w:r>
         <w:rPr>
@@ -846,74 +1577,122 @@
           <w:sz w:val="24"/>
           <w:szCs w:val="24"/>
         </w:rPr>
-        <w:t xml:space="preserve"> because: </w:t>
-      </w:r>
-      <w:r>
-        <w:rPr>
-          <w:rFonts w:ascii="Times New Roman" w:hAnsi="Times New Roman" w:cs="Times New Roman"/>
-          <w:sz w:val="24"/>
-          <w:szCs w:val="24"/>
-        </w:rPr>
-        <w:t>{</w:t>
-      </w:r>
-      <w:r>
-        <w:rPr>
-          <w:rFonts w:ascii="Times New Roman" w:hAnsi="Times New Roman" w:cs="Times New Roman"/>
-          <w:sz w:val="24"/>
-          <w:szCs w:val="24"/>
-        </w:rPr>
-        <w:t>{ missed_hearing_explanation }</w:t>
-      </w:r>
-      <w:r>
-        <w:rPr>
-          <w:rFonts w:ascii="Times New Roman" w:hAnsi="Times New Roman" w:cs="Times New Roman"/>
-          <w:sz w:val="24"/>
-          <w:szCs w:val="24"/>
-        </w:rPr>
-        <w:t>}</w:t>
-      </w:r>
-    </w:p>
-    <w:p>
-      <w:pPr>
-        <w:spacing w:after="0" w:line="240" w:lineRule="auto"/>
-        <w:rPr>
-          <w:rFonts w:ascii="Times New Roman" w:hAnsi="Times New Roman" w:cs="Times New Roman"/>
-          <w:sz w:val="24"/>
-          <w:szCs w:val="24"/>
-        </w:rPr>
-      </w:pPr>
-      <w:r>
-        <w:rPr>
-          <w:rFonts w:ascii="Times New Roman" w:hAnsi="Times New Roman" w:cs="Times New Roman"/>
-          <w:sz w:val="24"/>
-          <w:szCs w:val="24"/>
-        </w:rPr>
-        <w:t>{</w:t>
-      </w:r>
-      <w:r>
-        <w:rPr>
-          <w:rFonts w:ascii="Times New Roman" w:hAnsi="Times New Roman" w:cs="Times New Roman"/>
-          <w:sz w:val="24"/>
-          <w:szCs w:val="24"/>
-        </w:rPr>
-        <w:t>%</w:t>
-      </w:r>
-      <w:r>
-        <w:rPr>
-          <w:rFonts w:ascii="Times New Roman" w:hAnsi="Times New Roman" w:cs="Times New Roman"/>
-          <w:sz w:val="24"/>
-          <w:szCs w:val="24"/>
-        </w:rPr>
-        <w:t>p</w:t>
-      </w:r>
-      <w:r>
-        <w:rPr>
-          <w:rFonts w:ascii="Times New Roman" w:hAnsi="Times New Roman" w:cs="Times New Roman"/>
-          <w:sz w:val="24"/>
-          <w:szCs w:val="24"/>
-        </w:rPr>
-        <w:t xml:space="preserve"> endif</w:t>
-      </w:r>
+        <w:t xml:space="preserve">hearing, and a copy of the full record on appeal, to me at the above address. I also ask for time to submit a written argument after the Board sends me the transcript and record on appeal. </w:t>
+      </w:r>
+    </w:p>
+    <w:p>
+      <w:pPr>
+        <w:spacing w:after="0" w:line="240" w:lineRule="auto"/>
+        <w:rPr>
+          <w:rFonts w:ascii="Times New Roman" w:hAnsi="Times New Roman" w:cs="Times New Roman"/>
+          <w:sz w:val="24"/>
+          <w:szCs w:val="24"/>
+        </w:rPr>
+      </w:pPr>
+      <w:r>
+        <w:rPr>
+          <w:rFonts w:ascii="Times New Roman" w:hAnsi="Times New Roman" w:cs="Times New Roman"/>
+          <w:sz w:val="24"/>
+          <w:szCs w:val="24"/>
+        </w:rPr>
+        <w:t>{%p endif %}</w:t>
+      </w:r>
+    </w:p>
+    <w:p>
+      <w:pPr>
+        <w:spacing w:after="0" w:line="240" w:lineRule="auto"/>
+        <w:rPr>
+          <w:rFonts w:ascii="Times New Roman" w:hAnsi="Times New Roman" w:cs="Times New Roman"/>
+          <w:sz w:val="24"/>
+          <w:szCs w:val="24"/>
+        </w:rPr>
+      </w:pPr>
+    </w:p>
+    <w:p>
+      <w:pPr>
+        <w:spacing w:after="0" w:line="240" w:lineRule="auto"/>
+        <w:rPr>
+          <w:rFonts w:ascii="Times New Roman" w:hAnsi="Times New Roman" w:cs="Times New Roman"/>
+          <w:sz w:val="24"/>
+          <w:szCs w:val="24"/>
+        </w:rPr>
+      </w:pPr>
+      <w:r>
+        <w:rPr>
+          <w:rFonts w:ascii="Times New Roman" w:hAnsi="Times New Roman" w:cs="Times New Roman"/>
+          <w:sz w:val="24"/>
+          <w:szCs w:val="24"/>
+        </w:rPr>
+        <w:t xml:space="preserve">I certify that I served a copy of this letter </w:t>
+      </w:r>
+      <w:r>
+        <w:rPr>
+          <w:rFonts w:ascii="Times New Roman" w:hAnsi="Times New Roman" w:cs="Times New Roman"/>
+          <w:sz w:val="24"/>
+          <w:szCs w:val="24"/>
+        </w:rPr>
+        <w:t>to</w:t>
+      </w:r>
+      <w:r>
+        <w:rPr>
+          <w:rFonts w:ascii="Times New Roman" w:hAnsi="Times New Roman" w:cs="Times New Roman"/>
+          <w:sz w:val="24"/>
+          <w:szCs w:val="24"/>
+        </w:rPr>
+        <w:t xml:space="preserve"> </w:t>
+      </w:r>
+      <w:r>
+        <w:rPr>
+          <w:rFonts w:ascii="Times New Roman" w:hAnsi="Times New Roman" w:cs="Times New Roman"/>
+          <w:sz w:val="24"/>
+          <w:szCs w:val="24"/>
+        </w:rPr>
+        <w:t xml:space="preserve">{{ </w:t>
+      </w:r>
+      <w:proofErr w:type="spellStart"/>
+      <w:r>
+        <w:rPr>
+          <w:rFonts w:ascii="Times New Roman" w:hAnsi="Times New Roman" w:cs="Times New Roman"/>
+          <w:sz w:val="24"/>
+          <w:szCs w:val="24"/>
+        </w:rPr>
+        <w:t>employer.name_full</w:t>
+      </w:r>
+      <w:proofErr w:type="spellEnd"/>
+      <w:r>
+        <w:rPr>
+          <w:rFonts w:ascii="Times New Roman" w:hAnsi="Times New Roman" w:cs="Times New Roman"/>
+          <w:sz w:val="24"/>
+          <w:szCs w:val="24"/>
+        </w:rPr>
+        <w:t>() }}</w:t>
+      </w:r>
+      <w:r>
+        <w:rPr>
+          <w:rFonts w:ascii="Times New Roman" w:hAnsi="Times New Roman" w:cs="Times New Roman"/>
+          <w:sz w:val="24"/>
+          <w:szCs w:val="24"/>
+        </w:rPr>
+        <w:t xml:space="preserve"> </w:t>
+      </w:r>
+      <w:r>
+        <w:rPr>
+          <w:rFonts w:ascii="Times New Roman" w:hAnsi="Times New Roman" w:cs="Times New Roman"/>
+          <w:sz w:val="24"/>
+          <w:szCs w:val="24"/>
+        </w:rPr>
+        <w:t xml:space="preserve">{% if </w:t>
+      </w:r>
+      <w:proofErr w:type="spellStart"/>
+      <w:r>
+        <w:rPr>
+          <w:rFonts w:ascii="Times New Roman" w:hAnsi="Times New Roman" w:cs="Times New Roman"/>
+          <w:sz w:val="24"/>
+          <w:szCs w:val="24"/>
+        </w:rPr>
+        <w:t>delivery_date</w:t>
+      </w:r>
+      <w:proofErr w:type="spellEnd"/>
       <w:r>
         <w:rPr>
           <w:rFonts w:ascii="Times New Roman" w:hAnsi="Times New Roman" w:cs="Times New Roman"/>
@@ -922,107 +1701,65 @@
         </w:rPr>
         <w:t xml:space="preserve"> %}</w:t>
       </w:r>
-    </w:p>
-    <w:p>
-      <w:pPr>
-        <w:spacing w:after="0" w:line="240" w:lineRule="auto"/>
-        <w:rPr>
-          <w:rFonts w:ascii="Times New Roman" w:hAnsi="Times New Roman" w:cs="Times New Roman"/>
-          <w:sz w:val="24"/>
-          <w:szCs w:val="24"/>
-        </w:rPr>
-      </w:pPr>
-    </w:p>
-    <w:p>
-      <w:pPr>
-        <w:spacing w:after="0" w:line="240" w:lineRule="auto"/>
-        <w:rPr>
-          <w:rFonts w:ascii="Times New Roman" w:hAnsi="Times New Roman" w:cs="Times New Roman"/>
-          <w:sz w:val="24"/>
-          <w:szCs w:val="24"/>
-        </w:rPr>
-      </w:pPr>
-      <w:r>
-        <w:rPr>
-          <w:rFonts w:ascii="Times New Roman" w:hAnsi="Times New Roman" w:cs="Times New Roman"/>
-          <w:sz w:val="24"/>
-          <w:szCs w:val="24"/>
-        </w:rPr>
-        <w:t xml:space="preserve">{%p if </w:t>
-      </w:r>
-      <w:r>
-        <w:rPr>
-          <w:rFonts w:ascii="Times New Roman" w:hAnsi="Times New Roman" w:cs="Times New Roman"/>
-          <w:sz w:val="24"/>
-          <w:szCs w:val="24"/>
-        </w:rPr>
-        <w:t>request_transrcipt</w:t>
-      </w:r>
-      <w:r>
-        <w:rPr>
-          <w:rFonts w:ascii="Times New Roman" w:hAnsi="Times New Roman" w:cs="Times New Roman"/>
-          <w:sz w:val="24"/>
-          <w:szCs w:val="24"/>
-        </w:rPr>
-        <w:t xml:space="preserve"> %}</w:t>
-      </w:r>
-    </w:p>
-    <w:p>
-      <w:pPr>
-        <w:spacing w:after="0" w:line="240" w:lineRule="auto"/>
-        <w:rPr>
-          <w:rFonts w:ascii="Times New Roman" w:hAnsi="Times New Roman" w:cs="Times New Roman"/>
-          <w:sz w:val="24"/>
-          <w:szCs w:val="24"/>
-        </w:rPr>
-      </w:pPr>
-      <w:r>
-        <w:rPr>
-          <w:rFonts w:ascii="Times New Roman" w:hAnsi="Times New Roman" w:cs="Times New Roman"/>
-          <w:sz w:val="24"/>
-          <w:szCs w:val="24"/>
-        </w:rPr>
-        <w:t xml:space="preserve">Please send a copy of the transcript of the </w:t>
-      </w:r>
-      <w:r>
-        <w:rPr>
-          <w:rFonts w:ascii="Times New Roman" w:hAnsi="Times New Roman" w:cs="Times New Roman"/>
-          <w:sz w:val="24"/>
-          <w:szCs w:val="24"/>
-        </w:rPr>
-        <w:t>{{ hearing_date</w:t>
-      </w:r>
-      <w:r>
-        <w:rPr>
-          <w:rFonts w:ascii="Times New Roman" w:hAnsi="Times New Roman" w:cs="Times New Roman"/>
-          <w:sz w:val="24"/>
-          <w:szCs w:val="24"/>
-        </w:rPr>
-        <w:t>.format(“MMMM d, yyyy</w:t>
-      </w:r>
-      <w:r>
-        <w:rPr>
-          <w:rFonts w:ascii="Times New Roman" w:hAnsi="Times New Roman" w:cs="Times New Roman"/>
-          <w:sz w:val="24"/>
-          <w:szCs w:val="24"/>
-        </w:rPr>
-        <w:t>”</w:t>
-      </w:r>
-      <w:r>
-        <w:rPr>
-          <w:rFonts w:ascii="Times New Roman" w:hAnsi="Times New Roman" w:cs="Times New Roman"/>
-          <w:sz w:val="24"/>
-          <w:szCs w:val="24"/>
-        </w:rPr>
-        <w:t xml:space="preserve">) </w:t>
-      </w:r>
-      <w:r>
-        <w:rPr>
-          <w:rFonts w:ascii="Times New Roman" w:hAnsi="Times New Roman" w:cs="Times New Roman"/>
-          <w:sz w:val="24"/>
-          <w:szCs w:val="24"/>
-        </w:rPr>
-        <w:t>}}</w:t>
+      <w:r>
+        <w:rPr>
+          <w:rFonts w:ascii="Times New Roman" w:hAnsi="Times New Roman" w:cs="Times New Roman"/>
+          <w:sz w:val="24"/>
+          <w:szCs w:val="24"/>
+        </w:rPr>
+        <w:t xml:space="preserve">on {{ </w:t>
+      </w:r>
+      <w:proofErr w:type="spellStart"/>
+      <w:r>
+        <w:rPr>
+          <w:rFonts w:ascii="Times New Roman" w:hAnsi="Times New Roman" w:cs="Times New Roman"/>
+          <w:sz w:val="24"/>
+          <w:szCs w:val="24"/>
+        </w:rPr>
+        <w:t>delivery_date</w:t>
+      </w:r>
+      <w:r>
+        <w:rPr>
+          <w:rFonts w:ascii="Times New Roman" w:hAnsi="Times New Roman" w:cs="Times New Roman"/>
+          <w:sz w:val="24"/>
+          <w:szCs w:val="24"/>
+        </w:rPr>
+        <w:t>.format</w:t>
+      </w:r>
+      <w:proofErr w:type="spellEnd"/>
+      <w:r>
+        <w:rPr>
+          <w:rFonts w:ascii="Times New Roman" w:hAnsi="Times New Roman" w:cs="Times New Roman"/>
+          <w:sz w:val="24"/>
+          <w:szCs w:val="24"/>
+        </w:rPr>
+        <w:t>(“MM/dd/</w:t>
+      </w:r>
+      <w:proofErr w:type="spellStart"/>
+      <w:r>
+        <w:rPr>
+          <w:rFonts w:ascii="Times New Roman" w:hAnsi="Times New Roman" w:cs="Times New Roman"/>
+          <w:sz w:val="24"/>
+          <w:szCs w:val="24"/>
+        </w:rPr>
+        <w:t>yyyy</w:t>
+      </w:r>
+      <w:proofErr w:type="spellEnd"/>
+      <w:r>
+        <w:rPr>
+          <w:rFonts w:ascii="Times New Roman" w:hAnsi="Times New Roman" w:cs="Times New Roman"/>
+          <w:sz w:val="24"/>
+          <w:szCs w:val="24"/>
+        </w:rPr>
+        <w:t>”) }}</w:t>
+      </w:r>
+      <w:r>
+        <w:rPr>
+          <w:rFonts w:ascii="Times New Roman" w:hAnsi="Times New Roman" w:cs="Times New Roman"/>
+          <w:sz w:val="24"/>
+          <w:szCs w:val="24"/>
+        </w:rPr>
+        <w:t>{% endif %}</w:t>
       </w:r>
       <w:r>
         <w:rPr>
@@ -1038,131 +1775,23 @@
           <w:sz w:val="24"/>
           <w:szCs w:val="24"/>
         </w:rPr>
-        <w:t xml:space="preserve">hearing, and a copy of the full record on appeal, to me at the above address. I also ask for time to submit a written argument after the Board sends me the transcript and record on appeal. </w:t>
-      </w:r>
-    </w:p>
-    <w:p>
-      <w:pPr>
-        <w:spacing w:after="0" w:line="240" w:lineRule="auto"/>
-        <w:rPr>
-          <w:rFonts w:ascii="Times New Roman" w:hAnsi="Times New Roman" w:cs="Times New Roman"/>
-          <w:sz w:val="24"/>
-          <w:szCs w:val="24"/>
-        </w:rPr>
-      </w:pPr>
-      <w:r>
-        <w:rPr>
-          <w:rFonts w:ascii="Times New Roman" w:hAnsi="Times New Roman" w:cs="Times New Roman"/>
-          <w:sz w:val="24"/>
-          <w:szCs w:val="24"/>
-        </w:rPr>
-        <w:t>{%p endif %}</w:t>
-      </w:r>
-    </w:p>
-    <w:p>
-      <w:pPr>
-        <w:spacing w:after="0" w:line="240" w:lineRule="auto"/>
-        <w:rPr>
-          <w:rFonts w:ascii="Times New Roman" w:hAnsi="Times New Roman" w:cs="Times New Roman"/>
-          <w:sz w:val="24"/>
-          <w:szCs w:val="24"/>
-        </w:rPr>
-      </w:pPr>
-    </w:p>
-    <w:p>
-      <w:pPr>
-        <w:spacing w:after="0" w:line="240" w:lineRule="auto"/>
-        <w:rPr>
-          <w:rFonts w:ascii="Times New Roman" w:hAnsi="Times New Roman" w:cs="Times New Roman"/>
-          <w:sz w:val="24"/>
-          <w:szCs w:val="24"/>
-        </w:rPr>
-      </w:pPr>
-      <w:r>
-        <w:rPr>
-          <w:rFonts w:ascii="Times New Roman" w:hAnsi="Times New Roman" w:cs="Times New Roman"/>
-          <w:sz w:val="24"/>
-          <w:szCs w:val="24"/>
-        </w:rPr>
-        <w:t xml:space="preserve">I certify that I served a copy of this letter </w:t>
-      </w:r>
-      <w:r>
-        <w:rPr>
-          <w:rFonts w:ascii="Times New Roman" w:hAnsi="Times New Roman" w:cs="Times New Roman"/>
-          <w:sz w:val="24"/>
-          <w:szCs w:val="24"/>
-        </w:rPr>
-        <w:t>to</w:t>
-      </w:r>
-      <w:r>
-        <w:rPr>
-          <w:rFonts w:ascii="Times New Roman" w:hAnsi="Times New Roman" w:cs="Times New Roman"/>
-          <w:sz w:val="24"/>
-          <w:szCs w:val="24"/>
-        </w:rPr>
-        <w:t xml:space="preserve"> </w:t>
-      </w:r>
-      <w:r>
-        <w:rPr>
-          <w:rFonts w:ascii="Times New Roman" w:hAnsi="Times New Roman" w:cs="Times New Roman"/>
-          <w:sz w:val="24"/>
-          <w:szCs w:val="24"/>
-        </w:rPr>
-        <w:t>{{ employer.name_full() }}</w:t>
-      </w:r>
-      <w:r>
-        <w:rPr>
-          <w:rFonts w:ascii="Times New Roman" w:hAnsi="Times New Roman" w:cs="Times New Roman"/>
-          <w:sz w:val="24"/>
-          <w:szCs w:val="24"/>
-        </w:rPr>
-        <w:t xml:space="preserve"> on </w:t>
-      </w:r>
-      <w:r>
-        <w:rPr>
-          <w:rFonts w:ascii="Times New Roman" w:hAnsi="Times New Roman" w:cs="Times New Roman"/>
-          <w:sz w:val="24"/>
-          <w:szCs w:val="24"/>
-        </w:rPr>
-        <w:t xml:space="preserve">{{ </w:t>
-      </w:r>
-      <w:r>
-        <w:rPr>
-          <w:rFonts w:ascii="Times New Roman" w:hAnsi="Times New Roman" w:cs="Times New Roman"/>
-          <w:sz w:val="24"/>
-          <w:szCs w:val="24"/>
-        </w:rPr>
-        <w:t>delivery_date</w:t>
-      </w:r>
-      <w:r>
-        <w:rPr>
-          <w:rFonts w:ascii="Times New Roman" w:hAnsi="Times New Roman" w:cs="Times New Roman"/>
-          <w:sz w:val="24"/>
-          <w:szCs w:val="24"/>
-        </w:rPr>
-        <w:t xml:space="preserve">.format(“MM/dd/yyyy”) }} </w:t>
-      </w:r>
-      <w:r>
-        <w:rPr>
-          <w:rFonts w:ascii="Times New Roman" w:hAnsi="Times New Roman" w:cs="Times New Roman"/>
-          <w:sz w:val="24"/>
-          <w:szCs w:val="24"/>
-        </w:rPr>
         <w:t xml:space="preserve">along with the Notice of Appeal and additional evidence, if any. </w:t>
       </w:r>
     </w:p>
     <w:p>
       <w:pPr>
-        <w:spacing w:after="0" w:line="240" w:lineRule="auto"/>
-        <w:rPr>
-          <w:rFonts w:ascii="Times New Roman" w:hAnsi="Times New Roman" w:cs="Times New Roman"/>
-          <w:sz w:val="24"/>
-          <w:szCs w:val="24"/>
-        </w:rPr>
-      </w:pPr>
-    </w:p>
-    <w:p>
-      <w:pPr>
+        <w:keepLines/>
+        <w:spacing w:after="0" w:line="240" w:lineRule="auto"/>
+        <w:rPr>
+          <w:rFonts w:ascii="Times New Roman" w:hAnsi="Times New Roman" w:cs="Times New Roman"/>
+          <w:sz w:val="24"/>
+          <w:szCs w:val="24"/>
+        </w:rPr>
+      </w:pPr>
+    </w:p>
+    <w:p>
+      <w:pPr>
+        <w:keepLines/>
         <w:spacing w:after="0" w:line="240" w:lineRule="auto"/>
         <w:rPr>
           <w:rFonts w:ascii="Times New Roman" w:hAnsi="Times New Roman" w:cs="Times New Roman"/>
@@ -1181,26 +1810,29 @@
     </w:p>
     <w:p>
       <w:pPr>
-        <w:spacing w:after="0" w:line="240" w:lineRule="auto"/>
-        <w:rPr>
-          <w:rFonts w:ascii="Times New Roman" w:hAnsi="Times New Roman" w:cs="Times New Roman"/>
-          <w:sz w:val="24"/>
-          <w:szCs w:val="24"/>
-        </w:rPr>
-      </w:pPr>
-    </w:p>
-    <w:p>
-      <w:pPr>
-        <w:spacing w:after="0" w:line="240" w:lineRule="auto"/>
-        <w:rPr>
-          <w:rFonts w:ascii="Times New Roman" w:hAnsi="Times New Roman" w:cs="Times New Roman"/>
-          <w:sz w:val="24"/>
-          <w:szCs w:val="24"/>
-        </w:rPr>
-      </w:pPr>
-    </w:p>
-    <w:p>
-      <w:pPr>
+        <w:keepLines/>
+        <w:spacing w:after="0" w:line="240" w:lineRule="auto"/>
+        <w:rPr>
+          <w:rFonts w:ascii="Times New Roman" w:hAnsi="Times New Roman" w:cs="Times New Roman"/>
+          <w:sz w:val="24"/>
+          <w:szCs w:val="24"/>
+        </w:rPr>
+      </w:pPr>
+    </w:p>
+    <w:p>
+      <w:pPr>
+        <w:keepLines/>
+        <w:spacing w:after="0" w:line="240" w:lineRule="auto"/>
+        <w:rPr>
+          <w:rFonts w:ascii="Times New Roman" w:hAnsi="Times New Roman" w:cs="Times New Roman"/>
+          <w:sz w:val="24"/>
+          <w:szCs w:val="24"/>
+        </w:rPr>
+      </w:pPr>
+    </w:p>
+    <w:p>
+      <w:pPr>
+        <w:keepLines/>
         <w:tabs>
           <w:tab w:val="left" w:pos="5760"/>
         </w:tabs>
@@ -1224,6 +1856,7 @@
     </w:p>
     <w:p>
       <w:pPr>
+        <w:keepLines/>
         <w:spacing w:after="0" w:line="240" w:lineRule="auto"/>
         <w:rPr>
           <w:rFonts w:ascii="Times New Roman" w:hAnsi="Times New Roman" w:cs="Times New Roman"/>
@@ -1253,21 +1886,41 @@
           <w:sz w:val="24"/>
           <w:szCs w:val="24"/>
         </w:rPr>
-        <w:t>[0].name_full() }}</w:t>
-      </w:r>
-    </w:p>
-    <w:p>
-      <w:pPr>
-        <w:spacing w:after="0" w:line="240" w:lineRule="auto"/>
-        <w:rPr>
-          <w:rFonts w:ascii="Times New Roman" w:hAnsi="Times New Roman" w:cs="Times New Roman"/>
-          <w:sz w:val="24"/>
-          <w:szCs w:val="24"/>
-        </w:rPr>
-      </w:pPr>
-    </w:p>
-    <w:p>
-      <w:pPr>
+        <w:t>[0].</w:t>
+      </w:r>
+      <w:proofErr w:type="spellStart"/>
+      <w:r>
+        <w:rPr>
+          <w:rFonts w:ascii="Times New Roman" w:hAnsi="Times New Roman" w:cs="Times New Roman"/>
+          <w:sz w:val="24"/>
+          <w:szCs w:val="24"/>
+        </w:rPr>
+        <w:t>name_full</w:t>
+      </w:r>
+      <w:proofErr w:type="spellEnd"/>
+      <w:r>
+        <w:rPr>
+          <w:rFonts w:ascii="Times New Roman" w:hAnsi="Times New Roman" w:cs="Times New Roman"/>
+          <w:sz w:val="24"/>
+          <w:szCs w:val="24"/>
+        </w:rPr>
+        <w:t>() }}</w:t>
+      </w:r>
+    </w:p>
+    <w:p>
+      <w:pPr>
+        <w:keepLines/>
+        <w:spacing w:after="0" w:line="240" w:lineRule="auto"/>
+        <w:rPr>
+          <w:rFonts w:ascii="Times New Roman" w:hAnsi="Times New Roman" w:cs="Times New Roman"/>
+          <w:sz w:val="24"/>
+          <w:szCs w:val="24"/>
+        </w:rPr>
+      </w:pPr>
+    </w:p>
+    <w:p>
+      <w:pPr>
+        <w:keepLines/>
         <w:spacing w:after="0" w:line="240" w:lineRule="auto"/>
         <w:rPr>
           <w:rFonts w:ascii="Times New Roman" w:hAnsi="Times New Roman" w:cs="Times New Roman"/>
@@ -1289,44 +1942,187 @@
           <w:sz w:val="24"/>
           <w:szCs w:val="24"/>
         </w:rPr>
-        <w:t>{{ employer.name_full() }}</w:t>
-      </w:r>
-      <w:r>
-        <w:rPr>
-          <w:rFonts w:ascii="Times New Roman" w:hAnsi="Times New Roman" w:cs="Times New Roman"/>
-          <w:sz w:val="24"/>
-          <w:szCs w:val="24"/>
-        </w:rPr>
-        <w:t xml:space="preserve">, </w:t>
-      </w:r>
-      <w:r>
-        <w:rPr>
-          <w:rFonts w:ascii="Times New Roman" w:hAnsi="Times New Roman" w:cs="Times New Roman"/>
-          <w:sz w:val="24"/>
-          <w:szCs w:val="24"/>
-        </w:rPr>
-        <w:t>{{ employer.address.</w:t>
-      </w:r>
-      <w:r>
-        <w:rPr>
-          <w:rFonts w:ascii="Times New Roman" w:hAnsi="Times New Roman" w:cs="Times New Roman"/>
-          <w:sz w:val="24"/>
-          <w:szCs w:val="24"/>
-        </w:rPr>
-        <w:t>on_</w:t>
-      </w:r>
-      <w:r>
-        <w:rPr>
-          <w:rFonts w:ascii="Times New Roman" w:hAnsi="Times New Roman" w:cs="Times New Roman"/>
-          <w:sz w:val="24"/>
-          <w:szCs w:val="24"/>
-        </w:rPr>
-        <w:t>one_line() }}</w:t>
+        <w:t xml:space="preserve">{{ </w:t>
+      </w:r>
+      <w:proofErr w:type="spellStart"/>
+      <w:r>
+        <w:rPr>
+          <w:rFonts w:ascii="Times New Roman" w:hAnsi="Times New Roman" w:cs="Times New Roman"/>
+          <w:sz w:val="24"/>
+          <w:szCs w:val="24"/>
+        </w:rPr>
+        <w:t>employer.</w:t>
+      </w:r>
+      <w:r>
+        <w:rPr>
+          <w:rFonts w:ascii="Times New Roman" w:hAnsi="Times New Roman" w:cs="Times New Roman"/>
+          <w:sz w:val="24"/>
+          <w:szCs w:val="24"/>
+        </w:rPr>
+        <w:t>name_full</w:t>
+      </w:r>
+      <w:proofErr w:type="spellEnd"/>
+      <w:r>
+        <w:rPr>
+          <w:rFonts w:ascii="Times New Roman" w:hAnsi="Times New Roman" w:cs="Times New Roman"/>
+          <w:sz w:val="24"/>
+          <w:szCs w:val="24"/>
+        </w:rPr>
+        <w:t>()</w:t>
+      </w:r>
+      <w:r>
+        <w:rPr>
+          <w:rFonts w:ascii="Times New Roman" w:hAnsi="Times New Roman" w:cs="Times New Roman"/>
+          <w:sz w:val="24"/>
+          <w:szCs w:val="24"/>
+        </w:rPr>
+        <w:t xml:space="preserve"> }}</w:t>
+      </w:r>
+      <w:r>
+        <w:rPr>
+          <w:rFonts w:ascii="Times New Roman" w:hAnsi="Times New Roman" w:cs="Times New Roman"/>
+          <w:sz w:val="24"/>
+          <w:szCs w:val="24"/>
+        </w:rPr>
+        <w:br/>
+      </w:r>
+      <w:r>
+        <w:rPr>
+          <w:rFonts w:ascii="Times New Roman" w:hAnsi="Times New Roman" w:cs="Times New Roman"/>
+          <w:sz w:val="24"/>
+          <w:szCs w:val="24"/>
+        </w:rPr>
+        <w:t xml:space="preserve">{{ </w:t>
+      </w:r>
+      <w:proofErr w:type="spellStart"/>
+      <w:r>
+        <w:rPr>
+          <w:rFonts w:ascii="Times New Roman" w:hAnsi="Times New Roman" w:cs="Times New Roman"/>
+          <w:sz w:val="24"/>
+          <w:szCs w:val="24"/>
+        </w:rPr>
+        <w:t>employer.address.address</w:t>
+      </w:r>
+      <w:proofErr w:type="spellEnd"/>
+      <w:r>
+        <w:rPr>
+          <w:rFonts w:ascii="Times New Roman" w:hAnsi="Times New Roman" w:cs="Times New Roman"/>
+          <w:sz w:val="24"/>
+          <w:szCs w:val="24"/>
+        </w:rPr>
+        <w:t xml:space="preserve"> }}{% if </w:t>
+      </w:r>
+      <w:proofErr w:type="spellStart"/>
+      <w:r>
+        <w:rPr>
+          <w:rFonts w:ascii="Times New Roman" w:hAnsi="Times New Roman" w:cs="Times New Roman"/>
+          <w:sz w:val="24"/>
+          <w:szCs w:val="24"/>
+        </w:rPr>
+        <w:t>employer.address.unit</w:t>
+      </w:r>
+      <w:proofErr w:type="spellEnd"/>
+      <w:r>
+        <w:rPr>
+          <w:rFonts w:ascii="Times New Roman" w:hAnsi="Times New Roman" w:cs="Times New Roman"/>
+          <w:sz w:val="24"/>
+          <w:szCs w:val="24"/>
+        </w:rPr>
+        <w:t xml:space="preserve"> %},</w:t>
+      </w:r>
+      <w:r>
+        <w:rPr>
+          <w:rFonts w:ascii="Times New Roman" w:hAnsi="Times New Roman" w:cs="Times New Roman"/>
+          <w:sz w:val="24"/>
+          <w:szCs w:val="24"/>
+        </w:rPr>
+        <w:t xml:space="preserve"> </w:t>
+      </w:r>
+      <w:r>
+        <w:rPr>
+          <w:rFonts w:ascii="Times New Roman" w:hAnsi="Times New Roman" w:cs="Times New Roman"/>
+          <w:sz w:val="24"/>
+          <w:szCs w:val="24"/>
+        </w:rPr>
+        <w:t xml:space="preserve">{{ </w:t>
+      </w:r>
+      <w:proofErr w:type="spellStart"/>
+      <w:r>
+        <w:rPr>
+          <w:rFonts w:ascii="Times New Roman" w:hAnsi="Times New Roman" w:cs="Times New Roman"/>
+          <w:sz w:val="24"/>
+          <w:szCs w:val="24"/>
+        </w:rPr>
+        <w:t>employer.address.unit</w:t>
+      </w:r>
+      <w:proofErr w:type="spellEnd"/>
+      <w:r>
+        <w:rPr>
+          <w:rFonts w:ascii="Times New Roman" w:hAnsi="Times New Roman" w:cs="Times New Roman"/>
+          <w:sz w:val="24"/>
+          <w:szCs w:val="24"/>
+        </w:rPr>
+        <w:t xml:space="preserve"> }}{% endif %}</w:t>
+      </w:r>
+    </w:p>
+    <w:p>
+      <w:pPr>
+        <w:keepLines/>
+        <w:spacing w:after="0" w:line="240" w:lineRule="auto"/>
+        <w:rPr>
+          <w:rFonts w:ascii="Times New Roman" w:hAnsi="Times New Roman" w:cs="Times New Roman"/>
+          <w:sz w:val="24"/>
+          <w:szCs w:val="24"/>
+        </w:rPr>
+      </w:pPr>
+      <w:r>
+        <w:rPr>
+          <w:rFonts w:ascii="Times New Roman" w:hAnsi="Times New Roman" w:cs="Times New Roman"/>
+          <w:sz w:val="24"/>
+          <w:szCs w:val="24"/>
+        </w:rPr>
+        <w:t xml:space="preserve">{{ </w:t>
+      </w:r>
+      <w:proofErr w:type="spellStart"/>
+      <w:r>
+        <w:rPr>
+          <w:rFonts w:ascii="Times New Roman" w:hAnsi="Times New Roman" w:cs="Times New Roman"/>
+          <w:sz w:val="24"/>
+          <w:szCs w:val="24"/>
+        </w:rPr>
+        <w:t>employer.address.city</w:t>
+      </w:r>
+      <w:proofErr w:type="spellEnd"/>
+      <w:r>
+        <w:rPr>
+          <w:rFonts w:ascii="Times New Roman" w:hAnsi="Times New Roman" w:cs="Times New Roman"/>
+          <w:sz w:val="24"/>
+          <w:szCs w:val="24"/>
+        </w:rPr>
+        <w:t xml:space="preserve"> }} {{ </w:t>
+      </w:r>
+      <w:proofErr w:type="spellStart"/>
+      <w:r>
+        <w:rPr>
+          <w:rFonts w:ascii="Times New Roman" w:hAnsi="Times New Roman" w:cs="Times New Roman"/>
+          <w:sz w:val="24"/>
+          <w:szCs w:val="24"/>
+        </w:rPr>
+        <w:t>employer.address.city</w:t>
+      </w:r>
+      <w:proofErr w:type="spellEnd"/>
+      <w:r>
+        <w:rPr>
+          <w:rFonts w:ascii="Times New Roman" w:hAnsi="Times New Roman" w:cs="Times New Roman"/>
+          <w:sz w:val="24"/>
+          <w:szCs w:val="24"/>
+        </w:rPr>
+        <w:t xml:space="preserve"> }}, {{ employer.address.zip }}</w:t>
       </w:r>
     </w:p>
     <w:sectPr>
       <w:pgSz w:w="12240" w:h="15840"/>
-      <w:pgMar w:top="1440" w:right="1440" w:bottom="1440" w:left="1440" w:header="720" w:footer="720" w:gutter="0"/>
+      <w:pgMar w:top="720" w:right="720" w:bottom="720" w:left="720" w:header="720" w:footer="720" w:gutter="0"/>
       <w:cols w:space="720"/>
       <w:docGrid w:linePitch="360"/>
     </w:sectPr>
@@ -2058,6 +2854,7 @@
   <w:style w:type="character" w:default="1" w:styleId="DefaultParagraphFont">
     <w:name w:val="Default Paragraph Font"/>
     <w:uiPriority w:val="1"/>
+    <w:semiHidden/>
     <w:unhideWhenUsed/>
   </w:style>
   <w:style w:type="table" w:default="1" w:styleId="TableNormal">

</xml_diff>

<commit_message>
added requests plus tweaks after sme reviews
</commit_message>
<xml_diff>
--- a/docassemble/UIAppealAfterHearing/data/templates/cover_letter.docx
+++ b/docassemble/UIAppealAfterHearing/data/templates/cover_letter.docx
@@ -1922,7 +1922,41 @@
           <w:sz w:val="24"/>
           <w:szCs w:val="24"/>
         </w:rPr>
-        <w:t xml:space="preserve">hearing, and a copy of the full record on appeal, to me at the above address. I also ask for time to submit a written argument after the Board sends me the transcript and record on appeal. </w:t>
+        <w:t xml:space="preserve">hearing, and a copy of the full record on appeal, to me at the above address. </w:t>
+      </w:r>
+      <w:r>
+        <w:rPr>
+          <w:rFonts w:ascii="Times New Roman" w:hAnsi="Times New Roman" w:cs="Times New Roman"/>
+          <w:sz w:val="24"/>
+          <w:szCs w:val="24"/>
+        </w:rPr>
+        <w:t>See the enclosed Transcript Request (BOR) and File Review Request (BOR).</w:t>
+      </w:r>
+      <w:r>
+        <w:rPr>
+          <w:rFonts w:ascii="Times New Roman" w:hAnsi="Times New Roman" w:cs="Times New Roman"/>
+          <w:sz w:val="24"/>
+          <w:szCs w:val="24"/>
+        </w:rPr>
+        <w:t xml:space="preserve"> </w:t>
+      </w:r>
+      <w:proofErr w:type="gramStart"/>
+      <w:r>
+        <w:rPr>
+          <w:rFonts w:ascii="Times New Roman" w:hAnsi="Times New Roman" w:cs="Times New Roman"/>
+          <w:sz w:val="24"/>
+          <w:szCs w:val="24"/>
+        </w:rPr>
+        <w:t>I</w:t>
+      </w:r>
+      <w:proofErr w:type="gramEnd"/>
+      <w:r>
+        <w:rPr>
+          <w:rFonts w:ascii="Times New Roman" w:hAnsi="Times New Roman" w:cs="Times New Roman"/>
+          <w:sz w:val="24"/>
+          <w:szCs w:val="24"/>
+        </w:rPr>
+        <w:t xml:space="preserve"> also ask for time to submit a written argument after the Board sends me the transcript and record on appeal. </w:t>
       </w:r>
     </w:p>
     <w:p>

</xml_diff>